<commit_message>
docs: add direct project source code link to report and refresh package
</commit_message>
<xml_diff>
--- a/kiem_tra_thuong_ky/25765251_PhamNgocLang_baocao.docx
+++ b/kiem_tra_thuong_ky/25765251_PhamNgocLang_baocao.docx
@@ -225,6 +225,39 @@
                 <w:color w:val="0066CC"/>
               </w:rPr>
               <w:t>https://github.com/langpn/pthtth_21bvl_25765251</w:t>
+            </w:r>
+          </w:p>
+        </w:tc>
+      </w:tr>
+      <w:tr>
+        <w:tc>
+          <w:tcPr>
+            <w:tcW w:type="dxa" w:w="4968"/>
+            <w:shd w:val="clear" w:color="auto" w:fill="F2F2F2"/>
+          </w:tcPr>
+          <w:p>
+            <w:r>
+              <w:rPr>
+                <w:rFonts w:ascii="Times New Roman" w:hAnsi="Times New Roman"/>
+                <w:b/>
+              </w:rPr>
+              <w:t>Link Source Code bài kiểm tra:</w:t>
+            </w:r>
+          </w:p>
+        </w:tc>
+        <w:tc>
+          <w:tcPr>
+            <w:tcW w:type="dxa" w:w="4968"/>
+            <w:shd w:val="clear" w:color="auto" w:fill="FFFFFF"/>
+          </w:tcPr>
+          <w:p>
+            <w:r>
+              <w:rPr>
+                <w:rFonts w:ascii="Times New Roman" w:hAnsi="Times New Roman"/>
+                <w:b/>
+                <w:color w:val="0066CC"/>
+              </w:rPr>
+              <w:t>https://github.com/langpn/pthtth_21bvl_25765251/tree/main/kiem_tra_thuong_ky</w:t>
             </w:r>
           </w:p>
         </w:tc>

</xml_diff>